<commit_message>
Update questionnaire with pricing, regenerate docs
</commit_message>
<xml_diff>
--- a/client-questionnaire.docx
+++ b/client-questionnaire.docx
@@ -2,7 +2,7 @@
 <file path=word/document.xml><?xml version="1.0" encoding="utf-8"?>
 <w:document xmlns:w="http://schemas.openxmlformats.org/wordprocessingml/2006/main" xmlns:m="http://schemas.openxmlformats.org/officeDocument/2006/math" xmlns:r="http://schemas.openxmlformats.org/officeDocument/2006/relationships" xmlns:o="urn:schemas-microsoft-com:office:office" xmlns:v="urn:schemas-microsoft-com:vml" xmlns:w10="urn:schemas-microsoft-com:office:word" xmlns:a="http://schemas.openxmlformats.org/drawingml/2006/main" xmlns:pic="http://schemas.openxmlformats.org/drawingml/2006/picture" xmlns:wp="http://schemas.openxmlformats.org/drawingml/2006/wordprocessingDrawing">
   <w:body>
-    <w:bookmarkStart w:id="18" w:name="X301c76feeca5e2288bd26ed6317027c03ea52ff"/>
+    <w:bookmarkStart w:id="19" w:name="X301c76feeca5e2288bd26ed6317027c03ea52ff"/>
     <w:p>
       <w:pPr>
         <w:pStyle w:val="Heading1"/>
@@ -708,43 +708,36 @@
         </w:numPr>
       </w:pPr>
       <w:r>
-        <w:t xml:space="preserve">What domain do you want? Ideas:</w:t>
-      </w:r>
-    </w:p>
-    <w:p>
-      <w:pPr>
-        <w:pStyle w:val="Compact"/>
-        <w:numPr>
-          <w:ilvl w:val="1"/>
-          <w:numId w:val="1013"/>
-        </w:numPr>
-      </w:pPr>
-      <w:r>
+        <w:t xml:space="preserve">What domain do you want?</w:t>
+      </w:r>
+      <w:r>
+        <w:t xml:space="preserve"> </w:t>
+      </w:r>
+      <w:r>
+        <w:rPr>
+          <w:b/>
+          <w:bCs/>
+        </w:rPr>
         <w:t xml:space="preserve">portergeist.art</w:t>
       </w:r>
-    </w:p>
-    <w:p>
-      <w:pPr>
-        <w:pStyle w:val="Compact"/>
-        <w:numPr>
-          <w:ilvl w:val="1"/>
-          <w:numId w:val="1013"/>
-        </w:numPr>
-      </w:pPr>
-      <w:r>
-        <w:t xml:space="preserve">portergeist-art.com</w:t>
-      </w:r>
-    </w:p>
-    <w:p>
-      <w:pPr>
-        <w:pStyle w:val="Compact"/>
-        <w:numPr>
-          <w:ilvl w:val="1"/>
-          <w:numId w:val="1013"/>
-        </w:numPr>
-      </w:pPr>
-      <w:r>
-        <w:t xml:space="preserve">Something else?</w:t>
+      <w:r>
+        <w:t xml:space="preserve"> </w:t>
+      </w:r>
+      <w:r>
+        <w:t xml:space="preserve">is available —</w:t>
+      </w:r>
+      <w:r>
+        <w:t xml:space="preserve"> </w:t>
+      </w:r>
+      <w:r>
+        <w:rPr>
+          <w:b/>
+          <w:bCs/>
+        </w:rPr>
+        <w:t xml:space="preserve">$4/year</w:t>
+      </w:r>
+      <w:r>
+        <w:t xml:space="preserve">, that’s it.</w:t>
       </w:r>
     </w:p>
     <w:p>
@@ -757,6 +750,242 @@
       </w:pPr>
       <w:r>
         <w:t xml:space="preserve">Ready to go live, or want to sit on it and make changes first?</w:t>
+      </w:r>
+    </w:p>
+    <w:bookmarkEnd w:id="17"/>
+    <w:bookmarkStart w:id="18" w:name="what-this-costs"/>
+    <w:p>
+      <w:pPr>
+        <w:pStyle w:val="Heading2"/>
+      </w:pPr>
+      <w:r>
+        <w:t xml:space="preserve">💰 What This Costs</w:t>
+      </w:r>
+    </w:p>
+    <w:p>
+      <w:pPr>
+        <w:pStyle w:val="FirstParagraph"/>
+      </w:pPr>
+      <w:r>
+        <w:t xml:space="preserve">Here’s the breakdown — no hidden fees, no monthly hosting bills:</w:t>
+      </w:r>
+    </w:p>
+    <w:tbl>
+      <w:tblPr>
+        <w:tblStyle w:val="Table"/>
+        <w:tblW w:type="auto" w:w="0"/>
+        <w:tblLook w:firstRow="1" w:lastRow="0" w:firstColumn="0" w:lastColumn="0" w:noHBand="0" w:noVBand="0" w:val="0020"/>
+      </w:tblPr>
+      <w:tblGrid>
+        <w:gridCol w:w="3960"/>
+        <w:gridCol w:w="3960"/>
+      </w:tblGrid>
+      <w:tr>
+        <w:trPr>
+          <w:tblHeader w:val="on"/>
+        </w:trPr>
+        <w:tc>
+          <w:tcPr/>
+          <w:p>
+            <w:pPr>
+              <w:pStyle w:val="Compact"/>
+            </w:pPr>
+            <w:r>
+              <w:t xml:space="preserve">Item</w:t>
+            </w:r>
+          </w:p>
+        </w:tc>
+        <w:tc>
+          <w:tcPr/>
+          <w:p>
+            <w:pPr>
+              <w:pStyle w:val="Compact"/>
+            </w:pPr>
+            <w:r>
+              <w:t xml:space="preserve">Cost</w:t>
+            </w:r>
+          </w:p>
+        </w:tc>
+      </w:tr>
+      <w:tr>
+        <w:tc>
+          <w:tcPr/>
+          <w:p>
+            <w:pPr>
+              <w:pStyle w:val="Compact"/>
+            </w:pPr>
+            <w:r>
+              <w:t xml:space="preserve">Custom portfolio site</w:t>
+            </w:r>
+          </w:p>
+        </w:tc>
+        <w:tc>
+          <w:tcPr/>
+          <w:p>
+            <w:pPr>
+              <w:pStyle w:val="Compact"/>
+            </w:pPr>
+            <w:r>
+              <w:rPr>
+                <w:b/>
+                <w:bCs/>
+              </w:rPr>
+              <w:t xml:space="preserve">$0</w:t>
+            </w:r>
+          </w:p>
+        </w:tc>
+      </w:tr>
+      <w:tr>
+        <w:tc>
+          <w:tcPr/>
+          <w:p>
+            <w:pPr>
+              <w:pStyle w:val="Compact"/>
+            </w:pPr>
+            <w:r>
+              <w:t xml:space="preserve">Hosting (GitHub Pages)</w:t>
+            </w:r>
+          </w:p>
+        </w:tc>
+        <w:tc>
+          <w:tcPr/>
+          <w:p>
+            <w:pPr>
+              <w:pStyle w:val="Compact"/>
+            </w:pPr>
+            <w:r>
+              <w:rPr>
+                <w:b/>
+                <w:bCs/>
+              </w:rPr>
+              <w:t xml:space="preserve">$0</w:t>
+            </w:r>
+          </w:p>
+        </w:tc>
+      </w:tr>
+      <w:tr>
+        <w:tc>
+          <w:tcPr/>
+          <w:p>
+            <w:pPr>
+              <w:pStyle w:val="Compact"/>
+            </w:pPr>
+            <w:r>
+              <w:t xml:space="preserve">SSL / HTTPS</w:t>
+            </w:r>
+          </w:p>
+        </w:tc>
+        <w:tc>
+          <w:tcPr/>
+          <w:p>
+            <w:pPr>
+              <w:pStyle w:val="Compact"/>
+            </w:pPr>
+            <w:r>
+              <w:rPr>
+                <w:b/>
+                <w:bCs/>
+              </w:rPr>
+              <w:t xml:space="preserve">$0</w:t>
+            </w:r>
+          </w:p>
+        </w:tc>
+      </w:tr>
+      <w:tr>
+        <w:tc>
+          <w:tcPr/>
+          <w:p>
+            <w:pPr>
+              <w:pStyle w:val="Compact"/>
+            </w:pPr>
+            <w:r>
+              <w:t xml:space="preserve">Professional email (booking@portergeist.art)</w:t>
+            </w:r>
+          </w:p>
+        </w:tc>
+        <w:tc>
+          <w:tcPr/>
+          <w:p>
+            <w:pPr>
+              <w:pStyle w:val="Compact"/>
+            </w:pPr>
+            <w:r>
+              <w:rPr>
+                <w:b/>
+                <w:bCs/>
+              </w:rPr>
+              <w:t xml:space="preserve">$0</w:t>
+            </w:r>
+          </w:p>
+        </w:tc>
+      </w:tr>
+      <w:tr>
+        <w:tc>
+          <w:tcPr/>
+          <w:p>
+            <w:pPr>
+              <w:pStyle w:val="Compact"/>
+            </w:pPr>
+            <w:r>
+              <w:t xml:space="preserve">Domain (portergeist.art)</w:t>
+            </w:r>
+          </w:p>
+        </w:tc>
+        <w:tc>
+          <w:tcPr/>
+          <w:p>
+            <w:pPr>
+              <w:pStyle w:val="Compact"/>
+            </w:pPr>
+            <w:r>
+              <w:rPr>
+                <w:b/>
+                <w:bCs/>
+              </w:rPr>
+              <w:t xml:space="preserve">$4/year</w:t>
+            </w:r>
+          </w:p>
+        </w:tc>
+      </w:tr>
+      <w:tr>
+        <w:tc>
+          <w:tcPr/>
+          <w:p>
+            <w:pPr>
+              <w:pStyle w:val="Compact"/>
+            </w:pPr>
+            <w:r>
+              <w:rPr>
+                <w:b/>
+                <w:bCs/>
+              </w:rPr>
+              <w:t xml:space="preserve">Total</w:t>
+            </w:r>
+          </w:p>
+        </w:tc>
+        <w:tc>
+          <w:tcPr/>
+          <w:p>
+            <w:pPr>
+              <w:pStyle w:val="Compact"/>
+            </w:pPr>
+            <w:r>
+              <w:rPr>
+                <w:b/>
+                <w:bCs/>
+              </w:rPr>
+              <w:t xml:space="preserve">$4/year</w:t>
+            </w:r>
+          </w:p>
+        </w:tc>
+      </w:tr>
+    </w:tbl>
+    <w:p>
+      <w:pPr>
+        <w:pStyle w:val="BodyText"/>
+      </w:pPr>
+      <w:r>
+        <w:t xml:space="preserve">You get a professional portfolio site with a custom domain and branded email for less than a coffee. We handle the tech — you focus on the art.</w:t>
       </w:r>
     </w:p>
     <w:p>
@@ -790,8 +1019,8 @@
         <w:t xml:space="preserve">— Jay &amp; the Sudo Built Apps team</w:t>
       </w:r>
     </w:p>
-    <w:bookmarkEnd w:id="17"/>
     <w:bookmarkEnd w:id="18"/>
+    <w:bookmarkEnd w:id="19"/>
     <w:sectPr>
       <w:footnotePr>
         <w:numRestart w:val="eachSect"/>
@@ -2051,9 +2280,6 @@
     <w:lvlOverride w:ilvl="8">
       <w:startOverride w:val="25"/>
     </w:lvlOverride>
-  </w:num>
-  <w:num w:numId="1013">
-    <w:abstractNumId w:val="991"/>
   </w:num>
 </w:numbering>
 </file>

</xml_diff>